<commit_message>
fix: generación DOCX con pizzip+docxtemplater (Node puro, sin unzip ni soffice), plantillas con variables {}
</commit_message>
<xml_diff>
--- a/src/app/api/visitas/documento/1_Registro_Cliente_Hoja_Visita.docx
+++ b/src/app/api/visitas/documento/1_Registro_Cliente_Hoja_Visita.docx
@@ -65,7 +65,7 @@
           <w:rFonts w:ascii="Garamond" w:eastAsia="Garamond" w:hAnsi="Garamond" w:cs="Garamond"/>
           <w:color w:val="999999"/>
         </w:rPr>
-        <w:t>…………………</w:t>
+        <w:t>{ciudad}</w:t>
       </w:r>
       <w:r>
         <w:rPr>
@@ -79,7 +79,7 @@
           <w:rFonts w:ascii="Garamond" w:eastAsia="Garamond" w:hAnsi="Garamond" w:cs="Garamond"/>
           <w:color w:val="999999"/>
         </w:rPr>
-        <w:t>……</w:t>
+        <w:t>{dia}</w:t>
       </w:r>
       <w:r>
         <w:rPr>
@@ -93,7 +93,7 @@
           <w:rFonts w:ascii="Garamond" w:eastAsia="Garamond" w:hAnsi="Garamond" w:cs="Garamond"/>
           <w:color w:val="999999"/>
         </w:rPr>
-        <w:t>……………………</w:t>
+        <w:t>{mes}</w:t>
       </w:r>
       <w:r>
         <w:rPr>
@@ -107,7 +107,7 @@
           <w:rFonts w:ascii="Garamond" w:eastAsia="Garamond" w:hAnsi="Garamond" w:cs="Garamond"/>
           <w:color w:val="999999"/>
         </w:rPr>
-        <w:t>…………</w:t>
+        <w:t>{anyo}</w:t>
       </w:r>
     </w:p>
     <w:p>
@@ -170,7 +170,7 @@
                 <w:sz w:val="19"/>
                 <w:szCs w:val="19"/>
               </w:rPr>
-              <w:t>Dirección:</w:t>
+              <w:t>Dirección: {direccion}</w:t>
             </w:r>
           </w:p>
         </w:tc>
@@ -224,7 +224,7 @@
                 <w:sz w:val="19"/>
                 <w:szCs w:val="19"/>
               </w:rPr>
-              <w:t>Referencia catastral:</w:t>
+              <w:t>Referencia catastral: {ref_catastral}</w:t>
             </w:r>
           </w:p>
         </w:tc>
@@ -270,7 +270,7 @@
                 <w:sz w:val="19"/>
                 <w:szCs w:val="19"/>
               </w:rPr>
-              <w:t>Referencia Interna:</w:t>
+              <w:t>Referencia Interna: {ref_interna}</w:t>
             </w:r>
           </w:p>
         </w:tc>
@@ -316,7 +316,7 @@
                 <w:sz w:val="19"/>
                 <w:szCs w:val="19"/>
               </w:rPr>
-              <w:t>Precio publicación:</w:t>
+              <w:t>Precio publicación: {precio_publicacion}</w:t>
             </w:r>
           </w:p>
         </w:tc>
@@ -367,7 +367,7 @@
           <w:rFonts w:ascii="Garamond" w:eastAsia="Garamond" w:hAnsi="Garamond" w:cs="Garamond"/>
           <w:color w:val="1A2528"/>
         </w:rPr>
-        <w:t xml:space="preserve">D./Dña. …………………………………………………………………………………………, actuando como Agente Independiente en Colaboración con Nativa Properties (Mallorca Nativa, S.L., CIF B75396234), ha acompañado y asesorado al interesado en la visita al inmueble anteriormente descrito.</w:t>
+        <w:t xml:space="preserve">D./Dña. {nombre_agente}, actuando como Agente Independiente en Colaboración con Nativa Properties (Mallorca Nativa, S.L., CIF B75396234), ha acompañado y asesorado al interesado en la visita al inmueble anteriormente descrito.</w:t>
       </w:r>
     </w:p>
     <w:p>
@@ -430,7 +430,7 @@
                 <w:sz w:val="19"/>
                 <w:szCs w:val="19"/>
               </w:rPr>
-              <w:t>Nombre y Apellidos:</w:t>
+              <w:t>Nombre y Apellidos: {nombre_comprador_1}</w:t>
             </w:r>
           </w:p>
         </w:tc>
@@ -476,7 +476,7 @@
                 <w:sz w:val="19"/>
                 <w:szCs w:val="19"/>
               </w:rPr>
-              <w:t>DNI/NIE:</w:t>
+              <w:t>DNI/NIE: {dni_comprador_1}</w:t>
             </w:r>
           </w:p>
         </w:tc>
@@ -530,7 +530,7 @@
                 <w:sz w:val="19"/>
                 <w:szCs w:val="19"/>
               </w:rPr>
-              <w:t>Teléfono:</w:t>
+              <w:t>Teléfono: {telefono_comprador_1}</w:t>
             </w:r>
           </w:p>
         </w:tc>

</xml_diff>

<commit_message>
fix(visitas): fix buyer order and layout in contract templates
- Correct variable order: nombre_comprador_1 first, 2 second (was reversed)
- Each buyer now on separate lines: Nombre, DNI, Teléfono per buyer
- Add telefono_comprador_2 variable to all 3 templates
- Add telefono_comprador_2 to route.js render data

Fixes: buyers appearing concatenated on same line in PDF

Co-Authored-By: Claude Sonnet 4.6 <noreply@anthropic.com>
Claude-Session: https://claude.ai/code/session_01VwMpxzAmpxxuXHzGz5u6jp
</commit_message>
<xml_diff>
--- a/src/app/api/visitas/documento/1_Registro_Cliente_Hoja_Visita.docx
+++ b/src/app/api/visitas/documento/1_Registro_Cliente_Hoja_Visita.docx
@@ -1,281 +1,14 @@
 
-<file path=word/document.xml><?xml version="1.0" encoding="utf-8"?>
-<w:document xmlns:wpc="http://schemas.microsoft.com/office/word/2010/wordprocessingCanvas" xmlns:cx="http://schemas.microsoft.com/office/drawing/2014/chartex" xmlns:cx1="http://schemas.microsoft.com/office/drawing/2015/9/8/chartex" xmlns:cx2="http://schemas.microsoft.com/office/drawing/2015/10/21/chartex" xmlns:cx3="http://schemas.microsoft.com/office/drawing/2016/5/9/chartex" xmlns:cx4="http://schemas.microsoft.com/office/drawing/2016/5/10/chartex" xmlns:cx5="http://schemas.microsoft.com/office/drawing/2016/5/11/chartex" xmlns:cx6="http://schemas.microsoft.com/office/drawing/2016/5/12/chartex" xmlns:cx7="http://schemas.microsoft.com/office/drawing/2016/5/13/chartex" xmlns:cx8="http://schemas.microsoft.com/office/drawing/2016/5/14/chartex" xmlns:mc="http://schemas.openxmlformats.org/markup-compatibility/2006" xmlns:aink="http://schemas.microsoft.com/office/drawing/2016/ink" xmlns:am3d="http://schemas.microsoft.com/office/drawing/2017/model3d" xmlns:o="urn:schemas-microsoft-com:office:office" xmlns:r="http://schemas.openxmlformats.org/officeDocument/2006/relationships" xmlns:m="http://schemas.openxmlformats.org/officeDocument/2006/math" xmlns:v="urn:schemas-microsoft-com:vml" xmlns:wp14="http://schemas.microsoft.com/office/word/2010/wordprocessingDrawing" xmlns:wp="http://schemas.openxmlformats.org/drawingml/2006/wordprocessingDrawing" xmlns:w10="urn:schemas-microsoft-com:office:word" xmlns:w="http://schemas.openxmlformats.org/wordprocessingml/2006/main" xmlns:w14="http://schemas.microsoft.com/office/word/2010/wordml" xmlns:w15="http://schemas.microsoft.com/office/word/2012/wordml" xmlns:w16cex="http://schemas.microsoft.com/office/word/2018/wordml/cex" xmlns:w16cid="http://schemas.microsoft.com/office/word/2016/wordml/cid" xmlns:w16="http://schemas.microsoft.com/office/word/2018/wordml" xmlns:w16sdtdh="http://schemas.microsoft.com/office/word/2020/wordml/sdtdatahash" xmlns:w16se="http://schemas.microsoft.com/office/word/2015/wordml/symex" xmlns:wpg="http://schemas.microsoft.com/office/word/2010/wordprocessingGroup" xmlns:wpi="http://schemas.microsoft.com/office/word/2010/wordprocessingInk" xmlns:wne="http://schemas.microsoft.com/office/word/2006/wordml" xmlns:wps="http://schemas.microsoft.com/office/word/2010/wordprocessingShape" mc:Ignorable="w14 w15 w16se w16cid w16 w16cex w16sdtdh wp14">
-  <w:body>
-    <w:p>
-      <w:pPr>
-        <w:spacing w:after="60"/>
-        <w:jc w:val="center"/>
-      </w:pPr>
-      <w:r>
-        <w:rPr>
-          <w:rFonts w:ascii="Calibri" w:eastAsia="Calibri" w:hAnsi="Calibri" w:cs="Calibri"/>
-          <w:b/>
-          <w:color w:val="8F7141"/>
-          <w:sz w:val="18"/>
-        </w:rPr>
-        <w:t xml:space="preserve">NATIVA PROPERTIES</w:t>
-      </w:r>
-    </w:p>
-    <w:p>
-      <w:pPr>
-        <w:pBdr>
-          <w:bottom w:val="single" w:sz="10" w:space="0" w:color="405C6B"/>
-        </w:pBdr>
-        <w:spacing w:after="80"/>
-        <w:jc w:val="center"/>
-      </w:pPr>
-      <w:r>
-        <w:rPr>
-          <w:rFonts w:ascii="Calibri" w:eastAsia="Calibri" w:hAnsi="Calibri" w:cs="Calibri"/>
-          <w:b/>
-          <w:color w:val="405C6B"/>
-          <w:sz w:val="30"/>
-        </w:rPr>
-        <w:t xml:space="preserve">REGISTRO DE CLIENTE Y HOJA DE VISITA</w:t>
-      </w:r>
-    </w:p>
-    <w:p>
-      <w:pPr>
-        <w:spacing w:after="320"/>
-        <w:jc w:val="center"/>
-      </w:pPr>
-      <w:r>
-        <w:rPr>
-          <w:rFonts w:ascii="Garamond" w:eastAsia="Garamond" w:hAnsi="Garamond" w:cs="Garamond"/>
-          <w:i/>
-          <w:color w:val="555555"/>
-        </w:rPr>
-        <w:t xml:space="preserve">Registro de visita e interés en el inmueble</w:t>
-      </w:r>
-    </w:p>
-    <w:p>
-      <w:pPr>
-        <w:spacing w:after="280"/>
-      </w:pPr>
-      <w:r>
-        <w:rPr>
-          <w:rFonts w:ascii="Garamond" w:eastAsia="Garamond" w:hAnsi="Garamond" w:cs="Garamond"/>
-          <w:color w:val="1A2528"/>
-        </w:rPr>
-        <w:t xml:space="preserve">En {ciudad}, a {dia} de {mes} de {anyo}</w:t>
-      </w:r>
-    </w:p>
-    <w:p>
-      <w:pPr>
-        <w:spacing w:after="140"/>
-      </w:pPr>
-      <w:r>
-        <w:rPr>
-          <w:rFonts w:ascii="Calibri" w:eastAsia="Calibri" w:hAnsi="Calibri" w:cs="Calibri"/>
-          <w:b/>
-          <w:color w:val="405C6B"/>
-          <w:sz w:val="21"/>
-        </w:rPr>
-        <w:t xml:space="preserve">INMUEBLE VISITADO</w:t>
-      </w:r>
-    </w:p>
-    <w:p>
-      <w:r>
-        <w:t>Dirección: {direccion}</w:t>
-      </w:r>
-    </w:p>
-    <w:p>
-      <w:r>
-        <w:t xml:space="preserve">Referencia catastral: {ref_catastral}</w:t>
-      </w:r>
-    </w:p>
-    <w:p>
-      <w:r>
-        <w:t xml:space="preserve">Referencia Interna: {ref_interna}</w:t>
-      </w:r>
-    </w:p>
-    <w:p>
-      <w:r>
-        <w:t xml:space="preserve">Precio publicación: {precio_publicacion}</w:t>
-      </w:r>
-    </w:p>
-    <w:p>
-      <w:pPr>
-        <w:spacing w:after="120"/>
-      </w:pPr>
-    </w:p>
-    <w:p>
-      <w:pPr>
-        <w:spacing w:before="240" w:after="140"/>
-      </w:pPr>
-      <w:r>
-        <w:rPr>
-          <w:rFonts w:ascii="Calibri" w:eastAsia="Calibri" w:hAnsi="Calibri" w:cs="Calibri"/>
-          <w:b/>
-          <w:color w:val="405C6B"/>
-          <w:sz w:val="21"/>
-        </w:rPr>
-        <w:t xml:space="preserve">DATOS DEL AGENTE</w:t>
-      </w:r>
-    </w:p>
-    <w:p>
-      <w:pPr>
-        <w:spacing w:after="180"/>
-        <w:jc w:val="both"/>
-      </w:pPr>
-      <w:r>
-        <w:rPr>
-          <w:rFonts w:ascii="Garamond" w:eastAsia="Garamond" w:hAnsi="Garamond" w:cs="Garamond"/>
-          <w:color w:val="1A2528"/>
-        </w:rPr>
-        <w:t xml:space="preserve">D./Dña. {nombre_agente}, con DNI/NIE {dni_agente} y Nº Póliza RC {poliza_rc_agente}, actuando como Agente Independiente en Colaboración con Nativa Properties (Mallorca Nativa, S.L., CIF B75396234), ha acompañado y asesorado al interesado en la visita al inmueble anteriormente descrito.</w:t>
-      </w:r>
-    </w:p>
-    <w:p>
-      <w:pPr>
-        <w:spacing w:before="240" w:after="140"/>
-      </w:pPr>
-      <w:r>
-        <w:rPr>
-          <w:rFonts w:ascii="Calibri" w:eastAsia="Calibri" w:hAnsi="Calibri" w:cs="Calibri"/>
-          <w:b/>
-          <w:color w:val="405C6B"/>
-          <w:sz w:val="21"/>
-        </w:rPr>
-        <w:t xml:space="preserve">DATOS DEL INTERESADO (COMPRADOR POTENCIAL)</w:t>
-      </w:r>
-    </w:p>
-    <w:p>
-      <w:r>
-        <w:t xml:space="preserve">Nombre y Apellidos: {nombre_comprador_2} {nombre_comprador_1}</w:t>
-      </w:r>
-    </w:p>
-    <w:p>
-      <w:r>
-        <w:t>DNI/NIE: {dni_comprador_2} {dni_comprador_1}</w:t>
-      </w:r>
-    </w:p>
-    <w:p>
-      <w:r>
-        <w:t>Teléfono: {telefono_comprador_1}</w:t>
-      </w:r>
-    </w:p>
-    <w:p>
-      <w:pPr>
-        <w:spacing w:after="120"/>
-      </w:pPr>
-    </w:p>
-    <w:p>
-      <w:r>
-        <w:t xml:space="preserve">Nombre y Apellidos:</w:t>
-      </w:r>
-    </w:p>
-    <w:p>
-      <w:r>
-        <w:t>DNI/NIE:</w:t>
-      </w:r>
-    </w:p>
-    <w:p>
-      <w:pPr>
-        <w:spacing w:after="120"/>
-      </w:pPr>
-    </w:p>
-    <w:p>
-      <w:pPr>
-        <w:spacing w:before="240" w:after="140"/>
-      </w:pPr>
-      <w:r>
-        <w:rPr>
-          <w:rFonts w:ascii="Calibri" w:eastAsia="Calibri" w:hAnsi="Calibri" w:cs="Calibri"/>
-          <w:b/>
-          <w:color w:val="405C6B"/>
-          <w:sz w:val="21"/>
-        </w:rPr>
-        <w:t xml:space="preserve">DECLARACIÓN DEL INTERESADO</w:t>
-      </w:r>
-    </w:p>
-    <w:p>
-      <w:pPr>
-        <w:spacing w:after="180"/>
-        <w:jc w:val="both"/>
-      </w:pPr>
-      <w:r>
-        <w:rPr>
-          <w:rFonts w:ascii="Garamond" w:eastAsia="Garamond" w:hAnsi="Garamond" w:cs="Garamond"/>
-          <w:color w:val="1A2528"/>
-        </w:rPr>
-        <w:t xml:space="preserve">El interesado declara haber conocido y visitado el inmueble anteriormente descrito gracias a la gestión y difusión comercial de Nativa Properties (Mallorca Nativa, S.L., CIF B75396234).</w:t>
-      </w:r>
-    </w:p>
-    <w:p>
-      <w:pPr>
-        <w:spacing w:after="180"/>
-        <w:jc w:val="both"/>
-      </w:pPr>
-      <w:r>
-        <w:rPr>
-          <w:rFonts w:ascii="Garamond" w:eastAsia="Garamond" w:hAnsi="Garamond" w:cs="Garamond"/>
-          <w:color w:val="1A2528"/>
-        </w:rPr>
-        <w:t xml:space="preserve">Con el fin de poder ofrecer al interesado un acompañamiento continuado a lo largo de todo el proceso, y de proteger igualmente los intereses de la propiedad, el interesado se compromete a comunicarse exclusivamente con Nativa Properties para cualquier asunto relacionado con el inmueble citado. En ningún caso deberá contactar con los propietarios sin la presencia de un representante de la Agencia, ni divulgar los datos de la propiedad a terceros, especialmente a otras agencias intermediarias. Asimismo, el interesado no podrá adquirir la propiedad de forma personal, a través de familiares, de sociedades bajo su control efectivo, o de otras personas vinculadas, sin la intervención de Nativa Properties.</w:t>
-      </w:r>
-    </w:p>
-    <w:p>
-      <w:pPr>
-        <w:spacing w:before="240" w:after="140"/>
-      </w:pPr>
-      <w:r>
-        <w:rPr>
-          <w:rFonts w:ascii="Calibri" w:eastAsia="Calibri" w:hAnsi="Calibri" w:cs="Calibri"/>
-          <w:b/>
-          <w:color w:val="405C6B"/>
-          <w:sz w:val="21"/>
-        </w:rPr>
-        <w:t xml:space="preserve">PROTECCIÓN DE DATOS Y CONSENTIMIENTO</w:t>
-      </w:r>
-    </w:p>
-    <w:p>
-      <w:pPr>
-        <w:spacing w:after="180"/>
-        <w:jc w:val="both"/>
-      </w:pPr>
-      <w:r>
-        <w:rPr>
-          <w:rFonts w:ascii="Garamond" w:eastAsia="Garamond" w:hAnsi="Garamond" w:cs="Garamond"/>
-          <w:color w:val="1A2528"/>
-        </w:rPr>
-        <w:t xml:space="preserve">De conformidad con el Reglamento (UE) 2016/679 y la Ley Orgánica 3/2018, se informa de que los datos recogidos serán tratados por Mallorca Nativa, S.L. (Nativa Properties) como responsable del tratamiento, con la finalidad de gestionar el interés del interesado en el inmueble. Podrá ejercer sus derechos de acceso, rectificación, cancelación y oposición mediante escrito firmado, junto con copia de su DNI, a info@mallorcanativaproperties.com.</w:t>
-      </w:r>
-    </w:p>
-    <w:p>
-      <w:pPr>
-        <w:spacing w:before="240" w:after="140"/>
-      </w:pPr>
-      <w:r>
-        <w:rPr>
-          <w:rFonts w:ascii="Calibri" w:eastAsia="Calibri" w:hAnsi="Calibri" w:cs="Calibri"/>
-          <w:b/>
-          <w:color w:val="405C6B"/>
-          <w:sz w:val="21"/>
-        </w:rPr>
-        <w:t xml:space="preserve">FIRMAS DE CONFORMIDAD</w:t>
-      </w:r>
-    </w:p>
-    <w:p>
-      <w:r>
-        <w:t xml:space="preserve">Firma del Interesado Firma del Agente</w:t>
-      </w:r>
-    </w:p>
-    <w:p>
-      <w:pPr>
-        <w:spacing w:after="120"/>
-      </w:pPr>
-    </w:p>
-    <w:sectPr>
-      <w:footerReference w:type="default" r:id="rId7"/>
-      <w:pgSz w:w="11906" w:h="16838"/>
-      <w:pgMar w:top="1417" w:right="1701" w:bottom="1417" w:left="1701" w:header="708" w:footer="708" w:gutter="0"/>
-      <w:cols w:space="720"/>
-      <w:docGrid w:linePitch="360"/>
-    </w:sectPr>
-  </w:body>
-</w:document>
+<file path=word/document.xml><?xml version="1.0" encoding="UTF-8" standalone="yes"?>
+<w:document xmlns:wpc="http://schemas.microsoft.com/office/word/2010/wordprocessingCanvas" xmlns:cx="http://schemas.microsoft.com/office/drawing/2014/chartex" xmlns:cx1="http://schemas.microsoft.com/office/drawing/2015/9/8/chartex" xmlns:cx2="http://schemas.microsoft.com/office/drawing/2015/10/21/chartex" xmlns:cx3="http://schemas.microsoft.com/office/drawing/2016/5/9/chartex" xmlns:cx4="http://schemas.microsoft.com/office/drawing/2016/5/10/chartex" xmlns:cx5="http://schemas.microsoft.com/office/drawing/2016/5/11/chartex" xmlns:cx6="http://schemas.microsoft.com/office/drawing/2016/5/12/chartex" xmlns:cx7="http://schemas.microsoft.com/office/drawing/2016/5/13/chartex" xmlns:cx8="http://schemas.microsoft.com/office/drawing/2016/5/14/chartex" xmlns:mc="http://schemas.openxmlformats.org/markup-compatibility/2006" xmlns:aink="http://schemas.microsoft.com/office/drawing/2016/ink" xmlns:am3d="http://schemas.microsoft.com/office/drawing/2017/model3d" xmlns:o="urn:schemas-microsoft-com:office:office" xmlns:r="http://schemas.openxmlformats.org/officeDocument/2006/relationships" xmlns:m="http://schemas.openxmlformats.org/officeDocument/2006/math" xmlns:v="urn:schemas-microsoft-com:vml" xmlns:wp14="http://schemas.microsoft.com/office/word/2010/wordprocessingDrawing" xmlns:wp="http://schemas.openxmlformats.org/drawingml/2006/wordprocessingDrawing" xmlns:w10="urn:schemas-microsoft-com:office:word" xmlns:w="http://schemas.openxmlformats.org/wordprocessingml/2006/main" xmlns:w14="http://schemas.microsoft.com/office/word/2010/wordml" xmlns:w15="http://schemas.microsoft.com/office/word/2012/wordml" xmlns:w16cex="http://schemas.microsoft.com/office/word/2018/wordml/cex" xmlns:w16cid="http://schemas.microsoft.com/office/word/2016/wordml/cid" xmlns:w16="http://schemas.microsoft.com/office/word/2018/wordml" xmlns:w16sdtdh="http://schemas.microsoft.com/office/word/2020/wordml/sdtdatahash" xmlns:w16se="http://schemas.microsoft.com/office/word/2015/wordml/symex" xmlns:wpg="http://schemas.microsoft.com/office/word/2010/wordprocessingGroup" xmlns:wpi="http://schemas.microsoft.com/office/word/2010/wordprocessingInk" xmlns:wne="http://schemas.microsoft.com/office/word/2006/wordml" xmlns:wps="http://schemas.microsoft.com/office/word/2010/wordprocessingShape" mc:Ignorable="w14 w15 w16se w16cid w16 w16cex w16sdtdh wp14"><w:body><w:p><w:pPr><w:spacing w:after="60"/><w:jc w:val="center"/></w:pPr><w:r><w:rPr><w:rFonts w:ascii="Calibri" w:eastAsia="Calibri" w:hAnsi="Calibri" w:cs="Calibri"/><w:b/><w:color w:val="8F7141"/><w:sz w:val="18"/></w:rPr><w:t xml:space="preserve">NATIVA PROPERTIES</w:t></w:r></w:p><w:p><w:pPr><w:pBdr><w:bottom w:val="single" w:sz="10" w:space="0" w:color="405C6B"/></w:pBdr><w:spacing w:after="80"/><w:jc w:val="center"/></w:pPr><w:r><w:rPr><w:rFonts w:ascii="Calibri" w:eastAsia="Calibri" w:hAnsi="Calibri" w:cs="Calibri"/><w:b/><w:color w:val="405C6B"/><w:sz w:val="30"/></w:rPr><w:t xml:space="preserve">REGISTRO DE CLIENTE Y HOJA DE VISITA</w:t></w:r></w:p><w:p><w:pPr><w:spacing w:after="320"/><w:jc w:val="center"/></w:pPr><w:r><w:rPr><w:rFonts w:ascii="Garamond" w:eastAsia="Garamond" w:hAnsi="Garamond" w:cs="Garamond"/><w:i/><w:color w:val="555555"/></w:rPr><w:t xml:space="preserve">Registro de visita e interés en el inmueble</w:t></w:r></w:p><w:p><w:pPr><w:spacing w:after="280"/></w:pPr><w:r><w:rPr><w:rFonts w:ascii="Garamond" w:eastAsia="Garamond" w:hAnsi="Garamond" w:cs="Garamond"/><w:color w:val="1A2528"/></w:rPr><w:t xml:space="preserve">En {ciudad}, a {dia} de {mes} de {anyo}</w:t></w:r></w:p><w:p><w:pPr><w:spacing w:after="140"/></w:pPr><w:r><w:rPr><w:rFonts w:ascii="Calibri" w:eastAsia="Calibri" w:hAnsi="Calibri" w:cs="Calibri"/><w:b/><w:color w:val="405C6B"/><w:sz w:val="21"/></w:rPr><w:t xml:space="preserve">INMUEBLE VISITADO</w:t></w:r></w:p><w:p><w:r><w:t>Dirección: {direccion}</w:t></w:r></w:p>
+<w:p><w:r><w:t xml:space="preserve">Referencia catastral: {ref_catastral}</w:t></w:r></w:p>
+<w:p><w:r><w:t xml:space="preserve">Referencia Interna: {ref_interna}</w:t></w:r></w:p>
+<w:p><w:r><w:t xml:space="preserve">Precio publicación: {precio_publicacion}</w:t></w:r></w:p><w:p><w:pPr><w:spacing w:after="120"/></w:pPr></w:p><w:p><w:pPr><w:spacing w:before="240" w:after="140"/></w:pPr><w:r><w:rPr><w:rFonts w:ascii="Calibri" w:eastAsia="Calibri" w:hAnsi="Calibri" w:cs="Calibri"/><w:b/><w:color w:val="405C6B"/><w:sz w:val="21"/></w:rPr><w:t xml:space="preserve">DATOS DEL AGENTE</w:t></w:r></w:p><w:p><w:pPr><w:spacing w:after="180"/><w:jc w:val="both"/></w:pPr><w:r><w:rPr><w:rFonts w:ascii="Garamond" w:eastAsia="Garamond" w:hAnsi="Garamond" w:cs="Garamond"/><w:color w:val="1A2528"/></w:rPr><w:t xml:space="preserve">D./Dña. {nombre_agente}, con DNI/NIE {dni_agente} y Nº Póliza RC {poliza_rc_agente}, actuando como Agente Independiente en Colaboración con Nativa Properties (Mallorca Nativa, S.L., CIF B75396234), ha acompañado y asesorado al interesado en la visita al inmueble anteriormente descrito.</w:t></w:r></w:p><w:p><w:pPr><w:spacing w:before="240" w:after="140"/></w:pPr><w:r><w:rPr><w:rFonts w:ascii="Calibri" w:eastAsia="Calibri" w:hAnsi="Calibri" w:cs="Calibri"/><w:b/><w:color w:val="405C6B"/><w:sz w:val="21"/></w:rPr><w:t xml:space="preserve">DATOS DEL INTERESADO (COMPRADOR POTENCIAL)</w:t></w:r></w:p><w:p><w:r><w:t xml:space="preserve">Nombre y Apellidos: {nombre_comprador_1}</w:t></w:r></w:p>
+<w:p><w:r><w:t xml:space="preserve">DNI/NIE: {dni_comprador_1}</w:t></w:r></w:p>
+<w:p><w:r><w:t xml:space="preserve">Teléfono: {telefono_comprador_1}</w:t></w:r></w:p>
+<w:p><w:r><w:t xml:space="preserve">Nombre y Apellidos: {nombre_comprador_2}</w:t></w:r></w:p>
+<w:p><w:r><w:t xml:space="preserve">DNI/NIE: {dni_comprador_2}</w:t></w:r></w:p>
+<w:p><w:r><w:t xml:space="preserve">Teléfono: {telefono_comprador_2}</w:t></w:r></w:p><w:pPr><w:spacing w:after="120"/></w:pPr></w:p><w:p><w:pPr><w:spacing w:before="240" w:after="140"/></w:pPr><w:r><w:rPr><w:rFonts w:ascii="Calibri" w:eastAsia="Calibri" w:hAnsi="Calibri" w:cs="Calibri"/><w:b/><w:color w:val="405C6B"/><w:sz w:val="21"/></w:rPr><w:t xml:space="preserve">DECLARACIÓN DEL INTERESADO</w:t></w:r></w:p><w:p><w:pPr><w:spacing w:after="180"/><w:jc w:val="both"/></w:pPr><w:r><w:rPr><w:rFonts w:ascii="Garamond" w:eastAsia="Garamond" w:hAnsi="Garamond" w:cs="Garamond"/><w:color w:val="1A2528"/></w:rPr><w:t xml:space="preserve">El interesado declara haber conocido y visitado el inmueble anteriormente descrito gracias a la gestión y difusión comercial de Nativa Properties (Mallorca Nativa, S.L., CIF B75396234).</w:t></w:r></w:p><w:p><w:pPr><w:spacing w:after="180"/><w:jc w:val="both"/></w:pPr><w:r><w:rPr><w:rFonts w:ascii="Garamond" w:eastAsia="Garamond" w:hAnsi="Garamond" w:cs="Garamond"/><w:color w:val="1A2528"/></w:rPr><w:t xml:space="preserve">Con el fin de poder ofrecer al interesado un acompañamiento continuado a lo largo de todo el proceso, y de proteger igualmente los intereses de la propiedad, el interesado se compromete a comunicarse exclusivamente con Nativa Properties para cualquier asunto relacionado con el inmueble citado. En ningún caso deberá contactar con los propietarios sin la presencia de un representante de la Agencia, ni divulgar los datos de la propiedad a terceros, especialmente a otras agencias intermediarias. Asimismo, el interesado no podrá adquirir la propiedad de forma personal, a través de familiares, de sociedades bajo su control efectivo, o de otras personas vinculadas, sin la intervención de Nativa Properties.</w:t></w:r></w:p><w:p><w:pPr><w:spacing w:before="240" w:after="140"/></w:pPr><w:r><w:rPr><w:rFonts w:ascii="Calibri" w:eastAsia="Calibri" w:hAnsi="Calibri" w:cs="Calibri"/><w:b/><w:color w:val="405C6B"/><w:sz w:val="21"/></w:rPr><w:t xml:space="preserve">PROTECCIÓN DE DATOS Y CONSENTIMIENTO</w:t></w:r></w:p><w:p><w:pPr><w:spacing w:after="180"/><w:jc w:val="both"/></w:pPr><w:r><w:rPr><w:rFonts w:ascii="Garamond" w:eastAsia="Garamond" w:hAnsi="Garamond" w:cs="Garamond"/><w:color w:val="1A2528"/></w:rPr><w:t xml:space="preserve">De conformidad con el Reglamento (UE) 2016/679 y la Ley Orgánica 3/2018, se informa de que los datos recogidos serán tratados por Mallorca Nativa, S.L. (Nativa Properties) como responsable del tratamiento, con la finalidad de gestionar el interés del interesado en el inmueble. Podrá ejercer sus derechos de acceso, rectificación, cancelación y oposición mediante escrito firmado, junto con copia de su DNI, a info@mallorcanativaproperties.com.</w:t></w:r></w:p><w:p><w:pPr><w:spacing w:before="240" w:after="140"/></w:pPr><w:r><w:rPr><w:rFonts w:ascii="Calibri" w:eastAsia="Calibri" w:hAnsi="Calibri" w:cs="Calibri"/><w:b/><w:color w:val="405C6B"/><w:sz w:val="21"/></w:rPr><w:t xml:space="preserve">FIRMAS DE CONFORMIDAD</w:t></w:r></w:p><w:p><w:r><w:t xml:space="preserve">Firma del Interesado Firma del Agente</w:t></w:r></w:p><w:p><w:pPr><w:spacing w:after="120"/></w:pPr></w:p><w:sectPr><w:footerReference w:type="default" r:id="rId7"/><w:pgSz w:w="11906" w:h="16838"/><w:pgMar w:top="1417" w:right="1701" w:bottom="1417" w:left="1701" w:header="708" w:footer="708" w:gutter="0"/><w:cols w:space="720"/><w:docGrid w:linePitch="360"/></w:sectPr></w:body></w:document>
 </file>
 
 <file path=word/endnotes.xml><?xml version="1.0" encoding="utf-8"?>

</xml_diff>